<commit_message>
Updated links on document
</commit_message>
<xml_diff>
--- a/Final Web Page/Update1/JCooper_Update1_Final Web Site.docx
+++ b/Final Web Page/Update1/JCooper_Update1_Final Web Site.docx
@@ -20,10 +20,8 @@
         <w:r>
           <w:rPr>
             <w:rStyle w:val="Hyperlink"/>
-            <w:b/>
-            <w:bCs/>
           </w:rPr>
-          <w:t>https://jocooper317.github.io/SDEV153-WebPage/</w:t>
+          <w:t>https://github.com/jocooper317/SDEV153-WebPage.git</w:t>
         </w:r>
       </w:hyperlink>
     </w:p>
@@ -33,7 +31,7 @@
           <w:rPr>
             <w:rStyle w:val="Hyperlink"/>
           </w:rPr>
-          <w:t>Final Web Page/Update1</w:t>
+          <w:t>https://github.com/jocooper317/SDEV153-WebPage/tree/e88e03a2cdf4905d7e20339fc616307258adf9ae/Final%20Web%20Page/Update1</w:t>
         </w:r>
       </w:hyperlink>
     </w:p>
@@ -192,15 +190,7 @@
         <w:pStyle w:val="ListParagraph"/>
       </w:pPr>
       <w:r>
-        <w:t xml:space="preserve">Currently, I do not think I have any questions </w:t>
-      </w:r>
-      <w:proofErr w:type="gramStart"/>
-      <w:r>
-        <w:t>at this time</w:t>
-      </w:r>
-      <w:proofErr w:type="gramEnd"/>
-      <w:r>
-        <w:t xml:space="preserve">. </w:t>
+        <w:t xml:space="preserve">Currently, I do not think I have any questions at this time. </w:t>
       </w:r>
     </w:p>
     <w:sectPr>
@@ -1370,6 +1360,7 @@
   <w:style w:type="character" w:default="1" w:styleId="DefaultParagraphFont">
     <w:name w:val="Default Paragraph Font"/>
     <w:uiPriority w:val="1"/>
+    <w:semiHidden/>
     <w:unhideWhenUsed/>
   </w:style>
   <w:style w:type="table" w:default="1" w:styleId="TableNormal">
@@ -1748,6 +1739,18 @@
     <w:rPr>
       <w:color w:val="605E5C"/>
       <w:shd w:val="clear" w:color="auto" w:fill="E1DFDD"/>
+    </w:rPr>
+  </w:style>
+  <w:style w:type="character" w:styleId="FollowedHyperlink">
+    <w:name w:val="FollowedHyperlink"/>
+    <w:basedOn w:val="DefaultParagraphFont"/>
+    <w:uiPriority w:val="99"/>
+    <w:semiHidden/>
+    <w:unhideWhenUsed/>
+    <w:rsid w:val="00EE1228"/>
+    <w:rPr>
+      <w:color w:val="96607D" w:themeColor="followedHyperlink"/>
+      <w:u w:val="single"/>
     </w:rPr>
   </w:style>
 </w:styles>

</xml_diff>